<commit_message>
feat: add scope_target field + DOCUMENT_DATE_FULL auto-format
- Add scope_target column to projects table (with migration)
- Expose scope_target in create/update project API + portal UI
- Generator uses scope_target from project, not project name
- Add DOCUMENT_DATE_FULL auto-format (e.g. 'Thursday, 28 May 2026')
- Update initial_report_en.docx template with new tokens
</commit_message>
<xml_diff>
--- a/templates/initial_report_en.docx
+++ b/templates/initial_report_en.docx
@@ -206,7 +206,7 @@
           <w:szCs w:val="28"/>
           <w:rtl w:val="0"/>
         </w:rPr>
-        <w:t xml:space="preserve">Final Report</w:t>
+        <w:t xml:space="preserve">Initial Report</w:t>
       </w:r>
       <w:r>
         <w:rPr>
@@ -221,32 +221,6 @@
           <w:sz w:val="28"/>
           <w:szCs w:val="28"/>
         </w:rPr>
-      </w:pPr>
-      <w:r>
-        <w:rPr>
-          <w:rFonts w:ascii="Poppins" w:cs="Poppins" w:eastAsia="Poppins" w:hAnsi="Poppins"/>
-          <w:sz w:val="28"/>
-          <w:szCs w:val="28"/>
-          <w:rtl w:val="0"/>
-        </w:rPr>
-        <w:t xml:space="preserve">Friday, 11 October 2025</w:t>
-      </w:r>
-    </w:p>
-    <w:p>
-      <w:pPr>
-        <w:spacing w:after="200" w:line="276" w:lineRule="auto"/>
-        <w:rPr/>
-      </w:pPr>
-      <w:r>
-        <w:rPr>
-          <w:rtl w:val="0"/>
-        </w:rPr>
-      </w:r>
-    </w:p>
-    <w:p>
-      <w:pPr>
-        <w:spacing w:after="200" w:line="276" w:lineRule="auto"/>
-        <w:rPr/>
         <w:sectPr>
           <w:headerReference r:id="rId6" w:type="default"/>
           <w:headerReference r:id="rId7" w:type="first"/>
@@ -260,8 +234,12 @@
       </w:pPr>
       <w:r>
         <w:rPr>
-          <w:rtl w:val="0"/>
-        </w:rPr>
+          <w:rFonts w:ascii="Poppins" w:cs="Poppins" w:eastAsia="Poppins" w:hAnsi="Poppins"/>
+          <w:sz w:val="28"/>
+          <w:szCs w:val="28"/>
+          <w:rtl w:val="0"/>
+        </w:rPr>
+        <w:t xml:space="preserve">{{DOCUMENT_DATE_FULL}}</w:t>
       </w:r>
     </w:p>
     <w:p>
@@ -617,7 +595,7 @@
           <w:color w:val="351c75"/>
         </w:rPr>
       </w:pPr>
-      <w:bookmarkStart w:colFirst="0" w:colLast="0" w:name="_kuvsw1ijauhg" w:id="0"/>
+      <w:bookmarkStart w:colFirst="0" w:colLast="0" w:name="_9f74i4cvn9jm" w:id="0"/>
       <w:bookmarkEnd w:id="0"/>
       <w:r>
         <w:rPr>
@@ -891,7 +869,7 @@
         <w:pStyle w:val="Heading1"/>
         <w:rPr/>
       </w:pPr>
-      <w:bookmarkStart w:colFirst="0" w:colLast="0" w:name="_sp4ftbc2fmxn" w:id="1"/>
+      <w:bookmarkStart w:colFirst="0" w:colLast="0" w:name="_xmj4ghmqrk32" w:id="1"/>
       <w:bookmarkEnd w:id="1"/>
       <w:r>
         <w:br w:type="page"/>
@@ -907,7 +885,7 @@
         <w:pStyle w:val="Heading1"/>
         <w:rPr/>
       </w:pPr>
-      <w:bookmarkStart w:colFirst="0" w:colLast="0" w:name="_5vx41cmeazza" w:id="2"/>
+      <w:bookmarkStart w:colFirst="0" w:colLast="0" w:name="_x6jau3jqf1bp" w:id="2"/>
       <w:bookmarkEnd w:id="2"/>
       <w:r>
         <w:rPr>
@@ -1092,7 +1070,7 @@
           <w:szCs w:val="20"/>
         </w:rPr>
       </w:pPr>
-      <w:bookmarkStart w:colFirst="0" w:colLast="0" w:name="_uf68q5ctym10" w:id="3"/>
+      <w:bookmarkStart w:colFirst="0" w:colLast="0" w:name="_toksbh9bhldh" w:id="3"/>
       <w:bookmarkEnd w:id="3"/>
       <w:r>
         <w:rPr>
@@ -1138,7 +1116,7 @@
         <w:pStyle w:val="Heading1"/>
         <w:rPr/>
       </w:pPr>
-      <w:bookmarkStart w:colFirst="0" w:colLast="0" w:name="_ecl9o6x8tcxu" w:id="4"/>
+      <w:bookmarkStart w:colFirst="0" w:colLast="0" w:name="_qvnvhhg2vm7y" w:id="4"/>
       <w:bookmarkEnd w:id="4"/>
       <w:r>
         <w:rPr>
@@ -1149,7 +1127,7 @@
     </w:p>
     <w:sdt>
       <w:sdtPr>
-        <w:id w:val="1329524254"/>
+        <w:id w:val="-1716266103"/>
         <w:docPartObj>
           <w:docPartGallery w:val="Table of Contents"/>
           <w:docPartUnique w:val="1"/>
@@ -1185,7 +1163,7 @@
             <w:instrText xml:space="preserve"> TOC \h \u \z \t "Heading 1,1,Heading 2,2,Heading 3,3,Heading 4,4,Heading 5,5,Heading 6,6,"</w:instrText>
             <w:fldChar w:fldCharType="separate"/>
           </w:r>
-          <w:hyperlink w:anchor="_kuvsw1ijauhg">
+          <w:hyperlink w:anchor="_9f74i4cvn9jm">
             <w:r>
               <w:rPr>
                 <w:rFonts w:ascii="Nunito Sans" w:cs="Nunito Sans" w:eastAsia="Nunito Sans" w:hAnsi="Nunito Sans"/>
@@ -1238,7 +1216,7 @@
               <w:vertAlign w:val="baseline"/>
             </w:rPr>
           </w:pPr>
-          <w:hyperlink w:anchor="_5vx41cmeazza">
+          <w:hyperlink w:anchor="_x6jau3jqf1bp">
             <w:r>
               <w:rPr>
                 <w:rFonts w:ascii="Nunito Sans" w:cs="Nunito Sans" w:eastAsia="Nunito Sans" w:hAnsi="Nunito Sans"/>
@@ -1291,7 +1269,7 @@
               <w:vertAlign w:val="baseline"/>
             </w:rPr>
           </w:pPr>
-          <w:hyperlink w:anchor="_ecl9o6x8tcxu">
+          <w:hyperlink w:anchor="_qvnvhhg2vm7y">
             <w:r>
               <w:rPr>
                 <w:rFonts w:ascii="Nunito Sans" w:cs="Nunito Sans" w:eastAsia="Nunito Sans" w:hAnsi="Nunito Sans"/>
@@ -1344,7 +1322,7 @@
               <w:vertAlign w:val="baseline"/>
             </w:rPr>
           </w:pPr>
-          <w:hyperlink w:anchor="_6dg64obi6bta">
+          <w:hyperlink w:anchor="_4unryec5eakv">
             <w:r>
               <w:rPr>
                 <w:rFonts w:ascii="Nunito Sans" w:cs="Nunito Sans" w:eastAsia="Nunito Sans" w:hAnsi="Nunito Sans"/>
@@ -1398,7 +1376,7 @@
               <w:vertAlign w:val="baseline"/>
             </w:rPr>
           </w:pPr>
-          <w:hyperlink w:anchor="_ohqbl7ex35f7">
+          <w:hyperlink w:anchor="_kz7z74f3ferm">
             <w:r>
               <w:rPr>
                 <w:rFonts w:ascii="Nunito Sans" w:cs="Nunito Sans" w:eastAsia="Nunito Sans" w:hAnsi="Nunito Sans"/>
@@ -1451,7 +1429,7 @@
               <w:vertAlign w:val="baseline"/>
             </w:rPr>
           </w:pPr>
-          <w:hyperlink w:anchor="_x716f3d08iga">
+          <w:hyperlink w:anchor="_a2xo22ms9hta">
             <w:r>
               <w:rPr>
                 <w:rFonts w:ascii="Nunito Sans" w:cs="Nunito Sans" w:eastAsia="Nunito Sans" w:hAnsi="Nunito Sans"/>
@@ -1505,7 +1483,7 @@
               <w:vertAlign w:val="baseline"/>
             </w:rPr>
           </w:pPr>
-          <w:hyperlink w:anchor="_l38y1wly8m">
+          <w:hyperlink w:anchor="_etcwkduynw8f">
             <w:r>
               <w:rPr>
                 <w:rFonts w:ascii="Nunito Sans" w:cs="Nunito Sans" w:eastAsia="Nunito Sans" w:hAnsi="Nunito Sans"/>
@@ -1558,7 +1536,7 @@
               <w:vertAlign w:val="baseline"/>
             </w:rPr>
           </w:pPr>
-          <w:hyperlink w:anchor="_x8idl88z6zas">
+          <w:hyperlink w:anchor="_pdbw564g91jt">
             <w:r>
               <w:rPr>
                 <w:rFonts w:ascii="Nunito Sans" w:cs="Nunito Sans" w:eastAsia="Nunito Sans" w:hAnsi="Nunito Sans"/>
@@ -1612,7 +1590,7 @@
               <w:vertAlign w:val="baseline"/>
             </w:rPr>
           </w:pPr>
-          <w:hyperlink w:anchor="_l9h4k6hrd78y">
+          <w:hyperlink w:anchor="_pwooku6m47o">
             <w:r>
               <w:rPr>
                 <w:rFonts w:ascii="Nunito Sans" w:cs="Nunito Sans" w:eastAsia="Nunito Sans" w:hAnsi="Nunito Sans"/>
@@ -1666,7 +1644,7 @@
               <w:vertAlign w:val="baseline"/>
             </w:rPr>
           </w:pPr>
-          <w:hyperlink w:anchor="_dqu9d2bxrmz2">
+          <w:hyperlink w:anchor="_wnjdhmdqbg5">
             <w:r>
               <w:rPr>
                 <w:rFonts w:ascii="Nunito Sans" w:cs="Nunito Sans" w:eastAsia="Nunito Sans" w:hAnsi="Nunito Sans"/>
@@ -1720,7 +1698,7 @@
               <w:vertAlign w:val="baseline"/>
             </w:rPr>
           </w:pPr>
-          <w:hyperlink w:anchor="_9sjdf1152tuh">
+          <w:hyperlink w:anchor="_fduky1pshopq">
             <w:r>
               <w:rPr>
                 <w:rFonts w:ascii="Nunito Sans" w:cs="Nunito Sans" w:eastAsia="Nunito Sans" w:hAnsi="Nunito Sans"/>
@@ -1774,7 +1752,7 @@
               <w:vertAlign w:val="baseline"/>
             </w:rPr>
           </w:pPr>
-          <w:hyperlink w:anchor="_phn40tpe4hsx">
+          <w:hyperlink w:anchor="_ph05bbs1a64k">
             <w:r>
               <w:rPr>
                 <w:rFonts w:ascii="Nunito Sans" w:cs="Nunito Sans" w:eastAsia="Nunito Sans" w:hAnsi="Nunito Sans"/>
@@ -1828,7 +1806,7 @@
               <w:vertAlign w:val="baseline"/>
             </w:rPr>
           </w:pPr>
-          <w:hyperlink w:anchor="_ekr71b89khts">
+          <w:hyperlink w:anchor="_4tix79z7tg0j">
             <w:r>
               <w:rPr>
                 <w:rFonts w:ascii="Nunito Sans" w:cs="Nunito Sans" w:eastAsia="Nunito Sans" w:hAnsi="Nunito Sans"/>
@@ -1882,7 +1860,7 @@
               <w:vertAlign w:val="baseline"/>
             </w:rPr>
           </w:pPr>
-          <w:hyperlink w:anchor="_ipg09tapolc4">
+          <w:hyperlink w:anchor="_l0wmk8ze3byk">
             <w:r>
               <w:rPr>
                 <w:rFonts w:ascii="Nunito Sans" w:cs="Nunito Sans" w:eastAsia="Nunito Sans" w:hAnsi="Nunito Sans"/>
@@ -1936,7 +1914,7 @@
               <w:vertAlign w:val="baseline"/>
             </w:rPr>
           </w:pPr>
-          <w:hyperlink w:anchor="_zermxggvjrip">
+          <w:hyperlink w:anchor="_oljd6n3h6nbe">
             <w:r>
               <w:rPr>
                 <w:rFonts w:ascii="Nunito Sans" w:cs="Nunito Sans" w:eastAsia="Nunito Sans" w:hAnsi="Nunito Sans"/>
@@ -1990,7 +1968,7 @@
               <w:vertAlign w:val="baseline"/>
             </w:rPr>
           </w:pPr>
-          <w:hyperlink w:anchor="_t14kis3v5qps">
+          <w:hyperlink w:anchor="_mse1rpbzt15c">
             <w:r>
               <w:rPr>
                 <w:rFonts w:ascii="Nunito Sans" w:cs="Nunito Sans" w:eastAsia="Nunito Sans" w:hAnsi="Nunito Sans"/>
@@ -2044,7 +2022,7 @@
               <w:vertAlign w:val="baseline"/>
             </w:rPr>
           </w:pPr>
-          <w:hyperlink w:anchor="_6hrfgdm9qvpv">
+          <w:hyperlink w:anchor="_bz4t2tfq8uis">
             <w:r>
               <w:rPr>
                 <w:rFonts w:ascii="Nunito Sans" w:cs="Nunito Sans" w:eastAsia="Nunito Sans" w:hAnsi="Nunito Sans"/>
@@ -2098,7 +2076,7 @@
               <w:vertAlign w:val="baseline"/>
             </w:rPr>
           </w:pPr>
-          <w:hyperlink w:anchor="_dqhudu9o0mit">
+          <w:hyperlink w:anchor="_lkvl3kwpm4kv">
             <w:r>
               <w:rPr>
                 <w:rFonts w:ascii="Nunito Sans" w:cs="Nunito Sans" w:eastAsia="Nunito Sans" w:hAnsi="Nunito Sans"/>
@@ -2152,7 +2130,7 @@
               <w:vertAlign w:val="baseline"/>
             </w:rPr>
           </w:pPr>
-          <w:hyperlink w:anchor="_od0swgjbzkhk">
+          <w:hyperlink w:anchor="_9mxitufs07ew">
             <w:r>
               <w:rPr>
                 <w:rFonts w:ascii="Nunito Sans" w:cs="Nunito Sans" w:eastAsia="Nunito Sans" w:hAnsi="Nunito Sans"/>
@@ -2206,7 +2184,7 @@
               <w:vertAlign w:val="baseline"/>
             </w:rPr>
           </w:pPr>
-          <w:hyperlink w:anchor="_o4clkzuhr15l">
+          <w:hyperlink w:anchor="_16ze0jaj4y50">
             <w:r>
               <w:rPr>
                 <w:rFonts w:ascii="Nunito Sans" w:cs="Nunito Sans" w:eastAsia="Nunito Sans" w:hAnsi="Nunito Sans"/>
@@ -2260,7 +2238,7 @@
               <w:vertAlign w:val="baseline"/>
             </w:rPr>
           </w:pPr>
-          <w:hyperlink w:anchor="_4ve6v9wsrhpb">
+          <w:hyperlink w:anchor="_3xb2jjwd9qqy">
             <w:r>
               <w:rPr>
                 <w:rFonts w:ascii="Nunito Sans" w:cs="Nunito Sans" w:eastAsia="Nunito Sans" w:hAnsi="Nunito Sans"/>
@@ -2314,7 +2292,7 @@
               <w:vertAlign w:val="baseline"/>
             </w:rPr>
           </w:pPr>
-          <w:hyperlink w:anchor="_ltiyn6352djr">
+          <w:hyperlink w:anchor="_r00sm4vlv1n9">
             <w:r>
               <w:rPr>
                 <w:rFonts w:ascii="Nunito Sans" w:cs="Nunito Sans" w:eastAsia="Nunito Sans" w:hAnsi="Nunito Sans"/>
@@ -2367,7 +2345,7 @@
               <w:vertAlign w:val="baseline"/>
             </w:rPr>
           </w:pPr>
-          <w:hyperlink w:anchor="_sb30ef4fseov">
+          <w:hyperlink w:anchor="_x69x03t0zpbr">
             <w:r>
               <w:rPr>
                 <w:rFonts w:ascii="Nunito Sans" w:cs="Nunito Sans" w:eastAsia="Nunito Sans" w:hAnsi="Nunito Sans"/>
@@ -2420,7 +2398,7 @@
               <w:vertAlign w:val="baseline"/>
             </w:rPr>
           </w:pPr>
-          <w:hyperlink w:anchor="_qm8odj942vdv">
+          <w:hyperlink w:anchor="_mktauvycza3k">
             <w:r>
               <w:rPr>
                 <w:rFonts w:ascii="Nunito Sans" w:cs="Nunito Sans" w:eastAsia="Nunito Sans" w:hAnsi="Nunito Sans"/>
@@ -2473,7 +2451,7 @@
               <w:vertAlign w:val="baseline"/>
             </w:rPr>
           </w:pPr>
-          <w:hyperlink w:anchor="_db72lu992exr">
+          <w:hyperlink w:anchor="_41b9e2mw4ro8">
             <w:r>
               <w:rPr>
                 <w:rFonts w:ascii="Nunito Sans" w:cs="Nunito Sans" w:eastAsia="Nunito Sans" w:hAnsi="Nunito Sans"/>
@@ -2527,7 +2505,7 @@
               <w:vertAlign w:val="baseline"/>
             </w:rPr>
           </w:pPr>
-          <w:hyperlink w:anchor="_34tz6l7l62zd">
+          <w:hyperlink w:anchor="_mvgwi7fphj1p">
             <w:r>
               <w:rPr>
                 <w:rFonts w:ascii="Nunito Sans" w:cs="Nunito Sans" w:eastAsia="Nunito Sans" w:hAnsi="Nunito Sans"/>
@@ -2581,7 +2559,7 @@
               <w:vertAlign w:val="baseline"/>
             </w:rPr>
           </w:pPr>
-          <w:hyperlink w:anchor="_6u63seo8rzle">
+          <w:hyperlink w:anchor="_batz70rbfukk">
             <w:r>
               <w:rPr>
                 <w:rFonts w:ascii="Nunito Sans" w:cs="Nunito Sans" w:eastAsia="Nunito Sans" w:hAnsi="Nunito Sans"/>
@@ -2602,7 +2580,7 @@
               <w:t xml:space="preserve">1. </w:t>
             </w:r>
           </w:hyperlink>
-          <w:hyperlink w:anchor="_6u63seo8rzle">
+          <w:hyperlink w:anchor="_batz70rbfukk">
             <w:r>
               <w:rPr>
                 <w:rtl w:val="0"/>
@@ -2610,7 +2588,7 @@
               <w:t xml:space="preserve">{{FINDING_NAME}}</w:t>
             </w:r>
           </w:hyperlink>
-          <w:hyperlink w:anchor="_6u63seo8rzle">
+          <w:hyperlink w:anchor="_batz70rbfukk">
             <w:r>
               <w:rPr>
                 <w:rFonts w:ascii="Nunito Sans" w:cs="Nunito Sans" w:eastAsia="Nunito Sans" w:hAnsi="Nunito Sans"/>
@@ -2663,7 +2641,7 @@
               <w:vertAlign w:val="baseline"/>
             </w:rPr>
           </w:pPr>
-          <w:hyperlink w:anchor="_m07yhqdwxzyx">
+          <w:hyperlink w:anchor="_5fafj29pdgm">
             <w:r>
               <w:rPr>
                 <w:rFonts w:ascii="Nunito Sans" w:cs="Nunito Sans" w:eastAsia="Nunito Sans" w:hAnsi="Nunito Sans"/>
@@ -2717,7 +2695,7 @@
               <w:vertAlign w:val="baseline"/>
             </w:rPr>
           </w:pPr>
-          <w:hyperlink w:anchor="_6n3tpeg38w1u">
+          <w:hyperlink w:anchor="_pw98fb9dfxqh">
             <w:r>
               <w:rPr>
                 <w:rFonts w:ascii="Nunito Sans" w:cs="Nunito Sans" w:eastAsia="Nunito Sans" w:hAnsi="Nunito Sans"/>
@@ -2771,7 +2749,7 @@
               <w:vertAlign w:val="baseline"/>
             </w:rPr>
           </w:pPr>
-          <w:hyperlink w:anchor="_6ic15qb2zw5a">
+          <w:hyperlink w:anchor="_63m9ovryfvg6">
             <w:r>
               <w:rPr>
                 <w:rFonts w:ascii="Nunito Sans" w:cs="Nunito Sans" w:eastAsia="Nunito Sans" w:hAnsi="Nunito Sans"/>
@@ -2825,7 +2803,7 @@
               <w:vertAlign w:val="baseline"/>
             </w:rPr>
           </w:pPr>
-          <w:hyperlink w:anchor="_d1r7jfdw1o5z">
+          <w:hyperlink w:anchor="_k7w5jyplbp19">
             <w:r>
               <w:rPr>
                 <w:rFonts w:ascii="Nunito Sans" w:cs="Nunito Sans" w:eastAsia="Nunito Sans" w:hAnsi="Nunito Sans"/>
@@ -2879,7 +2857,7 @@
               <w:vertAlign w:val="baseline"/>
             </w:rPr>
           </w:pPr>
-          <w:hyperlink w:anchor="_szddppk8v207">
+          <w:hyperlink w:anchor="_7hreponcgkv9">
             <w:r>
               <w:rPr>
                 <w:rFonts w:ascii="Nunito Sans" w:cs="Nunito Sans" w:eastAsia="Nunito Sans" w:hAnsi="Nunito Sans"/>
@@ -2933,7 +2911,7 @@
               <w:vertAlign w:val="baseline"/>
             </w:rPr>
           </w:pPr>
-          <w:hyperlink w:anchor="_hwf1ds8bv8im">
+          <w:hyperlink w:anchor="_8rsekzj0w9os">
             <w:r>
               <w:rPr>
                 <w:rFonts w:ascii="Nunito Sans" w:cs="Nunito Sans" w:eastAsia="Nunito Sans" w:hAnsi="Nunito Sans"/>
@@ -2987,7 +2965,7 @@
               <w:vertAlign w:val="baseline"/>
             </w:rPr>
           </w:pPr>
-          <w:hyperlink w:anchor="_83tn2tjlei0e">
+          <w:hyperlink w:anchor="_d3gt6cgz0zv1">
             <w:r>
               <w:rPr>
                 <w:rFonts w:ascii="Nunito Sans" w:cs="Nunito Sans" w:eastAsia="Nunito Sans" w:hAnsi="Nunito Sans"/>
@@ -3008,7 +2986,7 @@
               <w:t xml:space="preserve">2. </w:t>
             </w:r>
           </w:hyperlink>
-          <w:hyperlink w:anchor="_83tn2tjlei0e">
+          <w:hyperlink w:anchor="_d3gt6cgz0zv1">
             <w:r>
               <w:rPr>
                 <w:rtl w:val="0"/>
@@ -3016,7 +2994,7 @@
               <w:t xml:space="preserve">{{FINDING_NAME}}</w:t>
             </w:r>
           </w:hyperlink>
-          <w:hyperlink w:anchor="_83tn2tjlei0e">
+          <w:hyperlink w:anchor="_d3gt6cgz0zv1">
             <w:r>
               <w:rPr>
                 <w:rFonts w:ascii="Nunito Sans" w:cs="Nunito Sans" w:eastAsia="Nunito Sans" w:hAnsi="Nunito Sans"/>
@@ -3069,7 +3047,7 @@
               <w:vertAlign w:val="baseline"/>
             </w:rPr>
           </w:pPr>
-          <w:hyperlink w:anchor="_b7y930xxspxp">
+          <w:hyperlink w:anchor="_lbsl2l8y8i9u">
             <w:r>
               <w:rPr>
                 <w:rFonts w:ascii="Nunito Sans" w:cs="Nunito Sans" w:eastAsia="Nunito Sans" w:hAnsi="Nunito Sans"/>
@@ -3123,7 +3101,7 @@
               <w:vertAlign w:val="baseline"/>
             </w:rPr>
           </w:pPr>
-          <w:hyperlink w:anchor="_v9d8clgobyf3">
+          <w:hyperlink w:anchor="_ousvfc650pkw">
             <w:r>
               <w:rPr>
                 <w:rFonts w:ascii="Nunito Sans" w:cs="Nunito Sans" w:eastAsia="Nunito Sans" w:hAnsi="Nunito Sans"/>
@@ -3177,7 +3155,7 @@
               <w:vertAlign w:val="baseline"/>
             </w:rPr>
           </w:pPr>
-          <w:hyperlink w:anchor="_6e11q2ttdgo7">
+          <w:hyperlink w:anchor="_mtz66iurlj9c">
             <w:r>
               <w:rPr>
                 <w:rFonts w:ascii="Nunito Sans" w:cs="Nunito Sans" w:eastAsia="Nunito Sans" w:hAnsi="Nunito Sans"/>
@@ -3231,7 +3209,7 @@
               <w:vertAlign w:val="baseline"/>
             </w:rPr>
           </w:pPr>
-          <w:hyperlink w:anchor="_xi9wuiecuey6">
+          <w:hyperlink w:anchor="_kgirfmsh0ily">
             <w:r>
               <w:rPr>
                 <w:rFonts w:ascii="Nunito Sans" w:cs="Nunito Sans" w:eastAsia="Nunito Sans" w:hAnsi="Nunito Sans"/>
@@ -3285,7 +3263,7 @@
               <w:vertAlign w:val="baseline"/>
             </w:rPr>
           </w:pPr>
-          <w:hyperlink w:anchor="_jjj1jcuj4sb6">
+          <w:hyperlink w:anchor="_88ma3qtjmo3i">
             <w:r>
               <w:rPr>
                 <w:rFonts w:ascii="Nunito Sans" w:cs="Nunito Sans" w:eastAsia="Nunito Sans" w:hAnsi="Nunito Sans"/>
@@ -3339,7 +3317,7 @@
               <w:vertAlign w:val="baseline"/>
             </w:rPr>
           </w:pPr>
-          <w:hyperlink w:anchor="_diapefpw5udh">
+          <w:hyperlink w:anchor="_t6qglqjscg7g">
             <w:r>
               <w:rPr>
                 <w:rFonts w:ascii="Nunito Sans" w:cs="Nunito Sans" w:eastAsia="Nunito Sans" w:hAnsi="Nunito Sans"/>
@@ -3393,7 +3371,7 @@
               <w:vertAlign w:val="baseline"/>
             </w:rPr>
           </w:pPr>
-          <w:hyperlink w:anchor="_57337v47jd0i">
+          <w:hyperlink w:anchor="_73uog8nwbi00">
             <w:r>
               <w:rPr>
                 <w:rFonts w:ascii="Nunito Sans" w:cs="Nunito Sans" w:eastAsia="Nunito Sans" w:hAnsi="Nunito Sans"/>
@@ -3414,7 +3392,7 @@
               <w:t xml:space="preserve">3. </w:t>
             </w:r>
           </w:hyperlink>
-          <w:hyperlink w:anchor="_57337v47jd0i">
+          <w:hyperlink w:anchor="_73uog8nwbi00">
             <w:r>
               <w:rPr>
                 <w:rtl w:val="0"/>
@@ -3422,7 +3400,7 @@
               <w:t xml:space="preserve">{{FINDING_NAME}}</w:t>
             </w:r>
           </w:hyperlink>
-          <w:hyperlink w:anchor="_57337v47jd0i">
+          <w:hyperlink w:anchor="_73uog8nwbi00">
             <w:r>
               <w:rPr>
                 <w:rFonts w:ascii="Nunito Sans" w:cs="Nunito Sans" w:eastAsia="Nunito Sans" w:hAnsi="Nunito Sans"/>
@@ -3475,7 +3453,7 @@
               <w:vertAlign w:val="baseline"/>
             </w:rPr>
           </w:pPr>
-          <w:hyperlink w:anchor="_ia98z5h8o4x9">
+          <w:hyperlink w:anchor="_n5zbj3wiga5a">
             <w:r>
               <w:rPr>
                 <w:rFonts w:ascii="Nunito Sans" w:cs="Nunito Sans" w:eastAsia="Nunito Sans" w:hAnsi="Nunito Sans"/>
@@ -3529,7 +3507,7 @@
               <w:vertAlign w:val="baseline"/>
             </w:rPr>
           </w:pPr>
-          <w:hyperlink w:anchor="_fbqg3ox7ktm9">
+          <w:hyperlink w:anchor="_kspntv4b5sn0">
             <w:r>
               <w:rPr>
                 <w:rFonts w:ascii="Nunito Sans" w:cs="Nunito Sans" w:eastAsia="Nunito Sans" w:hAnsi="Nunito Sans"/>
@@ -3583,7 +3561,7 @@
               <w:vertAlign w:val="baseline"/>
             </w:rPr>
           </w:pPr>
-          <w:hyperlink w:anchor="_eehqk0khei1s">
+          <w:hyperlink w:anchor="_whiivlh5hf4s">
             <w:r>
               <w:rPr>
                 <w:rFonts w:ascii="Nunito Sans" w:cs="Nunito Sans" w:eastAsia="Nunito Sans" w:hAnsi="Nunito Sans"/>
@@ -3637,7 +3615,7 @@
               <w:vertAlign w:val="baseline"/>
             </w:rPr>
           </w:pPr>
-          <w:hyperlink w:anchor="_z0n4aaldkiyn">
+          <w:hyperlink w:anchor="_y0558swwqi4b">
             <w:r>
               <w:rPr>
                 <w:rFonts w:ascii="Nunito Sans" w:cs="Nunito Sans" w:eastAsia="Nunito Sans" w:hAnsi="Nunito Sans"/>
@@ -3691,7 +3669,7 @@
               <w:vertAlign w:val="baseline"/>
             </w:rPr>
           </w:pPr>
-          <w:hyperlink w:anchor="_dj51as5pg2tq">
+          <w:hyperlink w:anchor="_ya20f4rxhc9g">
             <w:r>
               <w:rPr>
                 <w:rFonts w:ascii="Nunito Sans" w:cs="Nunito Sans" w:eastAsia="Nunito Sans" w:hAnsi="Nunito Sans"/>
@@ -3745,7 +3723,7 @@
               <w:vertAlign w:val="baseline"/>
             </w:rPr>
           </w:pPr>
-          <w:hyperlink w:anchor="_xx7yytsq2hg0">
+          <w:hyperlink w:anchor="_gnj2l4eo16by">
             <w:r>
               <w:rPr>
                 <w:rFonts w:ascii="Nunito Sans" w:cs="Nunito Sans" w:eastAsia="Nunito Sans" w:hAnsi="Nunito Sans"/>
@@ -3799,7 +3777,7 @@
               <w:vertAlign w:val="baseline"/>
             </w:rPr>
           </w:pPr>
-          <w:hyperlink w:anchor="_qefgbz3e549e">
+          <w:hyperlink w:anchor="_dy9a1u5n1p6n">
             <w:r>
               <w:rPr>
                 <w:rFonts w:ascii="Nunito Sans" w:cs="Nunito Sans" w:eastAsia="Nunito Sans" w:hAnsi="Nunito Sans"/>
@@ -3820,7 +3798,7 @@
               <w:t xml:space="preserve">4. </w:t>
             </w:r>
           </w:hyperlink>
-          <w:hyperlink w:anchor="_qefgbz3e549e">
+          <w:hyperlink w:anchor="_dy9a1u5n1p6n">
             <w:r>
               <w:rPr>
                 <w:rtl w:val="0"/>
@@ -3828,7 +3806,7 @@
               <w:t xml:space="preserve">{{FINDING_NAME}}</w:t>
             </w:r>
           </w:hyperlink>
-          <w:hyperlink w:anchor="_qefgbz3e549e">
+          <w:hyperlink w:anchor="_dy9a1u5n1p6n">
             <w:r>
               <w:rPr>
                 <w:rFonts w:ascii="Nunito Sans" w:cs="Nunito Sans" w:eastAsia="Nunito Sans" w:hAnsi="Nunito Sans"/>
@@ -3881,7 +3859,7 @@
               <w:vertAlign w:val="baseline"/>
             </w:rPr>
           </w:pPr>
-          <w:hyperlink w:anchor="_p6xoubbt4r76">
+          <w:hyperlink w:anchor="_xh3b4iokzdqu">
             <w:r>
               <w:rPr>
                 <w:rFonts w:ascii="Nunito Sans" w:cs="Nunito Sans" w:eastAsia="Nunito Sans" w:hAnsi="Nunito Sans"/>
@@ -3935,7 +3913,7 @@
               <w:vertAlign w:val="baseline"/>
             </w:rPr>
           </w:pPr>
-          <w:hyperlink w:anchor="_agntnzxkz3ld">
+          <w:hyperlink w:anchor="_zfmuns75aroa">
             <w:r>
               <w:rPr>
                 <w:rFonts w:ascii="Nunito Sans" w:cs="Nunito Sans" w:eastAsia="Nunito Sans" w:hAnsi="Nunito Sans"/>
@@ -3989,7 +3967,7 @@
               <w:vertAlign w:val="baseline"/>
             </w:rPr>
           </w:pPr>
-          <w:hyperlink w:anchor="_1iyg2kppj0uw">
+          <w:hyperlink w:anchor="_n97gsl55wopc">
             <w:r>
               <w:rPr>
                 <w:rFonts w:ascii="Nunito Sans" w:cs="Nunito Sans" w:eastAsia="Nunito Sans" w:hAnsi="Nunito Sans"/>
@@ -4043,7 +4021,7 @@
               <w:vertAlign w:val="baseline"/>
             </w:rPr>
           </w:pPr>
-          <w:hyperlink w:anchor="_y1vk9e8fi358">
+          <w:hyperlink w:anchor="_gla55jvkz6a">
             <w:r>
               <w:rPr>
                 <w:rFonts w:ascii="Nunito Sans" w:cs="Nunito Sans" w:eastAsia="Nunito Sans" w:hAnsi="Nunito Sans"/>
@@ -4097,7 +4075,7 @@
               <w:vertAlign w:val="baseline"/>
             </w:rPr>
           </w:pPr>
-          <w:hyperlink w:anchor="_m6n9u6yvz9d3">
+          <w:hyperlink w:anchor="_uvsmb7jmxc4t">
             <w:r>
               <w:rPr>
                 <w:rFonts w:ascii="Nunito Sans" w:cs="Nunito Sans" w:eastAsia="Nunito Sans" w:hAnsi="Nunito Sans"/>
@@ -4151,7 +4129,7 @@
               <w:vertAlign w:val="baseline"/>
             </w:rPr>
           </w:pPr>
-          <w:hyperlink w:anchor="_gxmdakj7lxdy">
+          <w:hyperlink w:anchor="_nvdf825mkew4">
             <w:r>
               <w:rPr>
                 <w:rFonts w:ascii="Nunito Sans" w:cs="Nunito Sans" w:eastAsia="Nunito Sans" w:hAnsi="Nunito Sans"/>
@@ -4205,7 +4183,7 @@
               <w:vertAlign w:val="baseline"/>
             </w:rPr>
           </w:pPr>
-          <w:hyperlink w:anchor="_hewjz7zchr0h">
+          <w:hyperlink w:anchor="_8uf0fdnf94ih">
             <w:r>
               <w:rPr>
                 <w:rFonts w:ascii="Nunito Sans" w:cs="Nunito Sans" w:eastAsia="Nunito Sans" w:hAnsi="Nunito Sans"/>
@@ -4226,7 +4204,7 @@
               <w:t xml:space="preserve">5. </w:t>
             </w:r>
           </w:hyperlink>
-          <w:hyperlink w:anchor="_hewjz7zchr0h">
+          <w:hyperlink w:anchor="_8uf0fdnf94ih">
             <w:r>
               <w:rPr>
                 <w:rtl w:val="0"/>
@@ -4234,7 +4212,7 @@
               <w:t xml:space="preserve">{{FINDING_NAME}}</w:t>
             </w:r>
           </w:hyperlink>
-          <w:hyperlink w:anchor="_hewjz7zchr0h">
+          <w:hyperlink w:anchor="_8uf0fdnf94ih">
             <w:r>
               <w:rPr>
                 <w:rFonts w:ascii="Nunito Sans" w:cs="Nunito Sans" w:eastAsia="Nunito Sans" w:hAnsi="Nunito Sans"/>
@@ -4287,7 +4265,7 @@
               <w:vertAlign w:val="baseline"/>
             </w:rPr>
           </w:pPr>
-          <w:hyperlink w:anchor="_epmzmefy370i">
+          <w:hyperlink w:anchor="_u2pbvy2a85gs">
             <w:r>
               <w:rPr>
                 <w:rFonts w:ascii="Nunito Sans" w:cs="Nunito Sans" w:eastAsia="Nunito Sans" w:hAnsi="Nunito Sans"/>
@@ -4341,7 +4319,7 @@
               <w:vertAlign w:val="baseline"/>
             </w:rPr>
           </w:pPr>
-          <w:hyperlink w:anchor="_ir6o4e3n7aut">
+          <w:hyperlink w:anchor="_5n6ezxlts6tj">
             <w:r>
               <w:rPr>
                 <w:rFonts w:ascii="Nunito Sans" w:cs="Nunito Sans" w:eastAsia="Nunito Sans" w:hAnsi="Nunito Sans"/>
@@ -4395,7 +4373,7 @@
               <w:vertAlign w:val="baseline"/>
             </w:rPr>
           </w:pPr>
-          <w:hyperlink w:anchor="_krxq6tml9fny">
+          <w:hyperlink w:anchor="_rs708rcobj0g">
             <w:r>
               <w:rPr>
                 <w:rFonts w:ascii="Nunito Sans" w:cs="Nunito Sans" w:eastAsia="Nunito Sans" w:hAnsi="Nunito Sans"/>
@@ -4449,7 +4427,7 @@
               <w:vertAlign w:val="baseline"/>
             </w:rPr>
           </w:pPr>
-          <w:hyperlink w:anchor="_f8g89ehfr2ph">
+          <w:hyperlink w:anchor="_o1hwatoi0ho1">
             <w:r>
               <w:rPr>
                 <w:rFonts w:ascii="Nunito Sans" w:cs="Nunito Sans" w:eastAsia="Nunito Sans" w:hAnsi="Nunito Sans"/>
@@ -4503,7 +4481,7 @@
               <w:vertAlign w:val="baseline"/>
             </w:rPr>
           </w:pPr>
-          <w:hyperlink w:anchor="_owb17uelwpas">
+          <w:hyperlink w:anchor="_guvmq3posqh5">
             <w:r>
               <w:rPr>
                 <w:rFonts w:ascii="Nunito Sans" w:cs="Nunito Sans" w:eastAsia="Nunito Sans" w:hAnsi="Nunito Sans"/>
@@ -4556,7 +4534,7 @@
               <w:vertAlign w:val="baseline"/>
             </w:rPr>
           </w:pPr>
-          <w:hyperlink w:anchor="_k8g20172asq3">
+          <w:hyperlink w:anchor="_ny7f644hca8g">
             <w:r>
               <w:rPr>
                 <w:rFonts w:ascii="Nunito Sans" w:cs="Nunito Sans" w:eastAsia="Nunito Sans" w:hAnsi="Nunito Sans"/>
@@ -4610,7 +4588,7 @@
               <w:vertAlign w:val="baseline"/>
             </w:rPr>
           </w:pPr>
-          <w:hyperlink w:anchor="_5o6kmq7zvynd">
+          <w:hyperlink w:anchor="_kntsh3wxl2b">
             <w:r>
               <w:rPr>
                 <w:rFonts w:ascii="Nunito Sans" w:cs="Nunito Sans" w:eastAsia="Nunito Sans" w:hAnsi="Nunito Sans"/>
@@ -4664,7 +4642,7 @@
               <w:vertAlign w:val="baseline"/>
             </w:rPr>
           </w:pPr>
-          <w:hyperlink w:anchor="_jjzg0efw0638">
+          <w:hyperlink w:anchor="_i79bjzxo2umt">
             <w:r>
               <w:rPr>
                 <w:rFonts w:ascii="Nunito Sans" w:cs="Nunito Sans" w:eastAsia="Nunito Sans" w:hAnsi="Nunito Sans"/>
@@ -4685,7 +4663,7 @@
               <w:t xml:space="preserve">1. </w:t>
             </w:r>
           </w:hyperlink>
-          <w:hyperlink w:anchor="_jjzg0efw0638">
+          <w:hyperlink w:anchor="_i79bjzxo2umt">
             <w:r>
               <w:rPr>
                 <w:rtl w:val="0"/>
@@ -4693,7 +4671,7 @@
               <w:t xml:space="preserve">{{FINDING_NAME}}</w:t>
             </w:r>
           </w:hyperlink>
-          <w:hyperlink w:anchor="_jjzg0efw0638">
+          <w:hyperlink w:anchor="_i79bjzxo2umt">
             <w:r>
               <w:rPr>
                 <w:rFonts w:ascii="Nunito Sans" w:cs="Nunito Sans" w:eastAsia="Nunito Sans" w:hAnsi="Nunito Sans"/>
@@ -4746,7 +4724,7 @@
               <w:vertAlign w:val="baseline"/>
             </w:rPr>
           </w:pPr>
-          <w:hyperlink w:anchor="_5lrk23dx6ms">
+          <w:hyperlink w:anchor="_a9esk7pjq4gi">
             <w:r>
               <w:rPr>
                 <w:rFonts w:ascii="Nunito Sans" w:cs="Nunito Sans" w:eastAsia="Nunito Sans" w:hAnsi="Nunito Sans"/>
@@ -4800,7 +4778,7 @@
               <w:vertAlign w:val="baseline"/>
             </w:rPr>
           </w:pPr>
-          <w:hyperlink w:anchor="_z3atsemz7yzt">
+          <w:hyperlink w:anchor="_p8edt96xsf3d">
             <w:r>
               <w:rPr>
                 <w:rFonts w:ascii="Nunito Sans" w:cs="Nunito Sans" w:eastAsia="Nunito Sans" w:hAnsi="Nunito Sans"/>
@@ -4854,7 +4832,7 @@
               <w:vertAlign w:val="baseline"/>
             </w:rPr>
           </w:pPr>
-          <w:hyperlink w:anchor="_in3poe9sdv2g">
+          <w:hyperlink w:anchor="_2q75mbgtznye">
             <w:r>
               <w:rPr>
                 <w:rFonts w:ascii="Nunito Sans" w:cs="Nunito Sans" w:eastAsia="Nunito Sans" w:hAnsi="Nunito Sans"/>
@@ -4875,7 +4853,7 @@
               <w:t xml:space="preserve">2. </w:t>
             </w:r>
           </w:hyperlink>
-          <w:hyperlink w:anchor="_in3poe9sdv2g">
+          <w:hyperlink w:anchor="_2q75mbgtznye">
             <w:r>
               <w:rPr>
                 <w:rtl w:val="0"/>
@@ -4883,7 +4861,7 @@
               <w:t xml:space="preserve">{{FINDING_NAME}}</w:t>
             </w:r>
           </w:hyperlink>
-          <w:hyperlink w:anchor="_in3poe9sdv2g">
+          <w:hyperlink w:anchor="_2q75mbgtznye">
             <w:r>
               <w:rPr>
                 <w:rFonts w:ascii="Nunito Sans" w:cs="Nunito Sans" w:eastAsia="Nunito Sans" w:hAnsi="Nunito Sans"/>
@@ -4936,7 +4914,7 @@
               <w:vertAlign w:val="baseline"/>
             </w:rPr>
           </w:pPr>
-          <w:hyperlink w:anchor="_qi80qwa44jjn">
+          <w:hyperlink w:anchor="_6n5rmga4br6n">
             <w:r>
               <w:rPr>
                 <w:rFonts w:ascii="Nunito Sans" w:cs="Nunito Sans" w:eastAsia="Nunito Sans" w:hAnsi="Nunito Sans"/>
@@ -4990,7 +4968,7 @@
               <w:vertAlign w:val="baseline"/>
             </w:rPr>
           </w:pPr>
-          <w:hyperlink w:anchor="_92ajbvazjkn3">
+          <w:hyperlink w:anchor="_jf46upq0s2te">
             <w:r>
               <w:rPr>
                 <w:rFonts w:ascii="Nunito Sans" w:cs="Nunito Sans" w:eastAsia="Nunito Sans" w:hAnsi="Nunito Sans"/>
@@ -5044,7 +5022,7 @@
               <w:vertAlign w:val="baseline"/>
             </w:rPr>
           </w:pPr>
-          <w:hyperlink w:anchor="_ilezuxbr9se5">
+          <w:hyperlink w:anchor="_vem60cyyw77p">
             <w:r>
               <w:rPr>
                 <w:rFonts w:ascii="Nunito Sans" w:cs="Nunito Sans" w:eastAsia="Nunito Sans" w:hAnsi="Nunito Sans"/>
@@ -5065,7 +5043,7 @@
               <w:t xml:space="preserve">3. </w:t>
             </w:r>
           </w:hyperlink>
-          <w:hyperlink w:anchor="_ilezuxbr9se5">
+          <w:hyperlink w:anchor="_vem60cyyw77p">
             <w:r>
               <w:rPr>
                 <w:rtl w:val="0"/>
@@ -5073,7 +5051,7 @@
               <w:t xml:space="preserve">{{FINDING_NAME}}</w:t>
             </w:r>
           </w:hyperlink>
-          <w:hyperlink w:anchor="_ilezuxbr9se5">
+          <w:hyperlink w:anchor="_vem60cyyw77p">
             <w:r>
               <w:rPr>
                 <w:rFonts w:ascii="Nunito Sans" w:cs="Nunito Sans" w:eastAsia="Nunito Sans" w:hAnsi="Nunito Sans"/>
@@ -5126,7 +5104,7 @@
               <w:vertAlign w:val="baseline"/>
             </w:rPr>
           </w:pPr>
-          <w:hyperlink w:anchor="_gjrrym3mhtwx">
+          <w:hyperlink w:anchor="_xbzjryd7cdlj">
             <w:r>
               <w:rPr>
                 <w:rFonts w:ascii="Nunito Sans" w:cs="Nunito Sans" w:eastAsia="Nunito Sans" w:hAnsi="Nunito Sans"/>
@@ -5180,7 +5158,7 @@
               <w:vertAlign w:val="baseline"/>
             </w:rPr>
           </w:pPr>
-          <w:hyperlink w:anchor="_o9fu3ssf5gcn">
+          <w:hyperlink w:anchor="_tparuyvyrmrl">
             <w:r>
               <w:rPr>
                 <w:rFonts w:ascii="Nunito Sans" w:cs="Nunito Sans" w:eastAsia="Nunito Sans" w:hAnsi="Nunito Sans"/>
@@ -5234,7 +5212,7 @@
               <w:vertAlign w:val="baseline"/>
             </w:rPr>
           </w:pPr>
-          <w:hyperlink w:anchor="_st14z9f9as5j">
+          <w:hyperlink w:anchor="_216aeyrmqqgg">
             <w:r>
               <w:rPr>
                 <w:rFonts w:ascii="Nunito Sans" w:cs="Nunito Sans" w:eastAsia="Nunito Sans" w:hAnsi="Nunito Sans"/>
@@ -5255,7 +5233,7 @@
               <w:t xml:space="preserve">4. </w:t>
             </w:r>
           </w:hyperlink>
-          <w:hyperlink w:anchor="_st14z9f9as5j">
+          <w:hyperlink w:anchor="_216aeyrmqqgg">
             <w:r>
               <w:rPr>
                 <w:rtl w:val="0"/>
@@ -5263,7 +5241,7 @@
               <w:t xml:space="preserve">{{FINDING_NAME}}</w:t>
             </w:r>
           </w:hyperlink>
-          <w:hyperlink w:anchor="_st14z9f9as5j">
+          <w:hyperlink w:anchor="_216aeyrmqqgg">
             <w:r>
               <w:rPr>
                 <w:rFonts w:ascii="Nunito Sans" w:cs="Nunito Sans" w:eastAsia="Nunito Sans" w:hAnsi="Nunito Sans"/>
@@ -5316,7 +5294,7 @@
               <w:vertAlign w:val="baseline"/>
             </w:rPr>
           </w:pPr>
-          <w:hyperlink w:anchor="_3jcawa7i5mml">
+          <w:hyperlink w:anchor="_w7mc54c7hb4g">
             <w:r>
               <w:rPr>
                 <w:rFonts w:ascii="Nunito Sans" w:cs="Nunito Sans" w:eastAsia="Nunito Sans" w:hAnsi="Nunito Sans"/>
@@ -5370,7 +5348,7 @@
               <w:vertAlign w:val="baseline"/>
             </w:rPr>
           </w:pPr>
-          <w:hyperlink w:anchor="_33vynn8dzqt4">
+          <w:hyperlink w:anchor="_t1ghgcfq8wub">
             <w:r>
               <w:rPr>
                 <w:rFonts w:ascii="Nunito Sans" w:cs="Nunito Sans" w:eastAsia="Nunito Sans" w:hAnsi="Nunito Sans"/>
@@ -5424,7 +5402,7 @@
               <w:vertAlign w:val="baseline"/>
             </w:rPr>
           </w:pPr>
-          <w:hyperlink w:anchor="_kfzikrhjl9ct">
+          <w:hyperlink w:anchor="_hbgs8jefcyhs">
             <w:r>
               <w:rPr>
                 <w:rFonts w:ascii="Nunito Sans" w:cs="Nunito Sans" w:eastAsia="Nunito Sans" w:hAnsi="Nunito Sans"/>
@@ -5445,7 +5423,7 @@
               <w:t xml:space="preserve">5. </w:t>
             </w:r>
           </w:hyperlink>
-          <w:hyperlink w:anchor="_kfzikrhjl9ct">
+          <w:hyperlink w:anchor="_hbgs8jefcyhs">
             <w:r>
               <w:rPr>
                 <w:rtl w:val="0"/>
@@ -5453,7 +5431,7 @@
               <w:t xml:space="preserve">{{FINDING_NAME}}</w:t>
             </w:r>
           </w:hyperlink>
-          <w:hyperlink w:anchor="_kfzikrhjl9ct">
+          <w:hyperlink w:anchor="_hbgs8jefcyhs">
             <w:r>
               <w:rPr>
                 <w:rFonts w:ascii="Nunito Sans" w:cs="Nunito Sans" w:eastAsia="Nunito Sans" w:hAnsi="Nunito Sans"/>
@@ -5506,7 +5484,7 @@
               <w:vertAlign w:val="baseline"/>
             </w:rPr>
           </w:pPr>
-          <w:hyperlink w:anchor="_vgedrz2brewp">
+          <w:hyperlink w:anchor="_i14d9z6ofo9k">
             <w:r>
               <w:rPr>
                 <w:rFonts w:ascii="Nunito Sans" w:cs="Nunito Sans" w:eastAsia="Nunito Sans" w:hAnsi="Nunito Sans"/>
@@ -5559,7 +5537,7 @@
               <w:vertAlign w:val="baseline"/>
             </w:rPr>
           </w:pPr>
-          <w:hyperlink w:anchor="_6azblliyy4qq">
+          <w:hyperlink w:anchor="_8iblj21rsagk">
             <w:r>
               <w:rPr>
                 <w:rFonts w:ascii="Nunito Sans" w:cs="Nunito Sans" w:eastAsia="Nunito Sans" w:hAnsi="Nunito Sans"/>
@@ -5623,7 +5601,7 @@
           <w:color w:val="674ea7"/>
         </w:rPr>
       </w:pPr>
-      <w:bookmarkStart w:colFirst="0" w:colLast="0" w:name="_6dg64obi6bta" w:id="5"/>
+      <w:bookmarkStart w:colFirst="0" w:colLast="0" w:name="_4unryec5eakv" w:id="5"/>
       <w:bookmarkEnd w:id="5"/>
       <w:r>
         <w:rPr>
@@ -5806,7 +5784,7 @@
           <w:szCs w:val="24"/>
         </w:rPr>
       </w:pPr>
-      <w:bookmarkStart w:colFirst="0" w:colLast="0" w:name="_ohqbl7ex35f7" w:id="6"/>
+      <w:bookmarkStart w:colFirst="0" w:colLast="0" w:name="_kz7z74f3ferm" w:id="6"/>
       <w:bookmarkEnd w:id="6"/>
       <w:r>
         <w:rPr>
@@ -6073,7 +6051,7 @@
                 <w:szCs w:val="20"/>
                 <w:rtl w:val="0"/>
               </w:rPr>
-              <w:t xml:space="preserve">25 September 2025</w:t>
+              <w:t xml:space="preserve">{{DOCUMENT_DATE}}</w:t>
             </w:r>
           </w:p>
         </w:tc>
@@ -6228,7 +6206,7 @@
                 <w:szCs w:val="20"/>
                 <w:rtl w:val="0"/>
               </w:rPr>
-              <w:t xml:space="preserve">25 September 2025</w:t>
+              <w:t xml:space="preserve">{{DOCUMENT_DATE}}</w:t>
             </w:r>
           </w:p>
         </w:tc>
@@ -6657,7 +6635,7 @@
           <w:szCs w:val="32"/>
         </w:rPr>
       </w:pPr>
-      <w:bookmarkStart w:colFirst="0" w:colLast="0" w:name="_x716f3d08iga" w:id="7"/>
+      <w:bookmarkStart w:colFirst="0" w:colLast="0" w:name="_a2xo22ms9hta" w:id="7"/>
       <w:bookmarkEnd w:id="7"/>
       <w:r>
         <w:rPr>
@@ -6680,7 +6658,7 @@
           <w:szCs w:val="24"/>
         </w:rPr>
       </w:pPr>
-      <w:bookmarkStart w:colFirst="0" w:colLast="0" w:name="_l38y1wly8m" w:id="8"/>
+      <w:bookmarkStart w:colFirst="0" w:colLast="0" w:name="_etcwkduynw8f" w:id="8"/>
       <w:bookmarkEnd w:id="8"/>
       <w:r>
         <w:rPr>
@@ -7476,7 +7454,7 @@
         <w:pStyle w:val="Heading1"/>
         <w:rPr/>
       </w:pPr>
-      <w:bookmarkStart w:colFirst="0" w:colLast="0" w:name="_7b8xxvkghapx" w:id="9"/>
+      <w:bookmarkStart w:colFirst="0" w:colLast="0" w:name="_bgodx7lk0hlc" w:id="9"/>
       <w:bookmarkEnd w:id="9"/>
       <w:r>
         <w:rPr>
@@ -8034,7 +8012,7 @@
         <w:spacing w:before="0" w:line="276" w:lineRule="auto"/>
         <w:rPr/>
       </w:pPr>
-      <w:bookmarkStart w:colFirst="0" w:colLast="0" w:name="_vu4yeceu7wkj" w:id="10"/>
+      <w:bookmarkStart w:colFirst="0" w:colLast="0" w:name="_btiij8uoa8w8" w:id="10"/>
       <w:bookmarkEnd w:id="10"/>
       <w:r>
         <w:br w:type="page"/>
@@ -8051,7 +8029,7 @@
         <w:spacing w:before="0" w:line="276" w:lineRule="auto"/>
         <w:rPr/>
       </w:pPr>
-      <w:bookmarkStart w:colFirst="0" w:colLast="0" w:name="_x8idl88z6zas" w:id="11"/>
+      <w:bookmarkStart w:colFirst="0" w:colLast="0" w:name="_pdbw564g91jt" w:id="11"/>
       <w:bookmarkEnd w:id="11"/>
       <w:r>
         <w:rPr>
@@ -8066,7 +8044,7 @@
         <w:spacing w:before="0" w:lineRule="auto"/>
         <w:rPr/>
       </w:pPr>
-      <w:bookmarkStart w:colFirst="0" w:colLast="0" w:name="_l9h4k6hrd78y" w:id="12"/>
+      <w:bookmarkStart w:colFirst="0" w:colLast="0" w:name="_pwooku6m47o" w:id="12"/>
       <w:bookmarkEnd w:id="12"/>
       <w:r>
         <w:rPr>
@@ -8146,7 +8124,7 @@
         <w:spacing w:before="0" w:lineRule="auto"/>
         <w:rPr/>
       </w:pPr>
-      <w:bookmarkStart w:colFirst="0" w:colLast="0" w:name="_dqu9d2bxrmz2" w:id="13"/>
+      <w:bookmarkStart w:colFirst="0" w:colLast="0" w:name="_wnjdhmdqbg5" w:id="13"/>
       <w:bookmarkEnd w:id="13"/>
       <w:r>
         <w:rPr>
@@ -8661,7 +8639,7 @@
         </w:rPr>
         <w:t xml:space="preserve">Detailed information about the test scope can be found in </w:t>
       </w:r>
-      <w:hyperlink w:anchor="_6azblliyy4qq">
+      <w:hyperlink w:anchor="_8iblj21rsagk">
         <w:r>
           <w:rPr>
             <w:color w:val="1155cc"/>
@@ -8704,7 +8682,7 @@
         <w:spacing w:before="0" w:lineRule="auto"/>
         <w:rPr/>
       </w:pPr>
-      <w:bookmarkStart w:colFirst="0" w:colLast="0" w:name="_9sjdf1152tuh" w:id="14"/>
+      <w:bookmarkStart w:colFirst="0" w:colLast="0" w:name="_fduky1pshopq" w:id="14"/>
       <w:bookmarkEnd w:id="14"/>
       <w:r>
         <w:rPr>
@@ -8728,7 +8706,7 @@
           <wp:anchor allowOverlap="1" behindDoc="0" distB="114300" distT="114300" distL="114300" distR="114300" hidden="0" layoutInCell="1" locked="0" relativeHeight="0" simplePos="0">
             <wp:simplePos x="0" y="0"/>
             <wp:positionH relativeFrom="column">
-              <wp:posOffset>19053</wp:posOffset>
+              <wp:posOffset>19055</wp:posOffset>
             </wp:positionH>
             <wp:positionV relativeFrom="paragraph">
               <wp:posOffset>600075</wp:posOffset>
@@ -8736,12 +8714,12 @@
             <wp:extent cx="5943600" cy="1397000"/>
             <wp:effectExtent b="0" l="0" r="0" t="0"/>
             <wp:wrapSquare wrapText="bothSides" distB="114300" distT="114300" distL="114300" distR="114300"/>
-            <wp:docPr id="13" name="image6.png"/>
+            <wp:docPr id="13" name="image1.png"/>
             <a:graphic>
               <a:graphicData uri="http://schemas.openxmlformats.org/drawingml/2006/picture">
                 <pic:pic>
                   <pic:nvPicPr>
-                    <pic:cNvPr id="0" name="image6.png"/>
+                    <pic:cNvPr id="0" name="image1.png"/>
                     <pic:cNvPicPr preferRelativeResize="0"/>
                   </pic:nvPicPr>
                   <pic:blipFill>
@@ -8828,7 +8806,7 @@
         <w:pStyle w:val="Heading2"/>
         <w:rPr/>
       </w:pPr>
-      <w:bookmarkStart w:colFirst="0" w:colLast="0" w:name="_nv9v1tqpuxbi" w:id="15"/>
+      <w:bookmarkStart w:colFirst="0" w:colLast="0" w:name="_lclh30cn7ey" w:id="15"/>
       <w:bookmarkEnd w:id="15"/>
       <w:r>
         <w:br w:type="page"/>
@@ -8845,7 +8823,7 @@
         <w:spacing w:before="0" w:lineRule="auto"/>
         <w:rPr/>
       </w:pPr>
-      <w:bookmarkStart w:colFirst="0" w:colLast="0" w:name="_phn40tpe4hsx" w:id="16"/>
+      <w:bookmarkStart w:colFirst="0" w:colLast="0" w:name="_ph05bbs1a64k" w:id="16"/>
       <w:bookmarkEnd w:id="16"/>
       <w:r>
         <w:rPr>
@@ -9922,7 +9900,7 @@
         <w:spacing w:before="0" w:lineRule="auto"/>
         <w:rPr/>
       </w:pPr>
-      <w:bookmarkStart w:colFirst="0" w:colLast="0" w:name="_ekr71b89khts" w:id="17"/>
+      <w:bookmarkStart w:colFirst="0" w:colLast="0" w:name="_4tix79z7tg0j" w:id="17"/>
       <w:bookmarkEnd w:id="17"/>
       <w:r>
         <w:rPr>
@@ -9947,7 +9925,7 @@
         <w:pStyle w:val="Heading3"/>
         <w:rPr/>
       </w:pPr>
-      <w:bookmarkStart w:colFirst="0" w:colLast="0" w:name="_ipg09tapolc4" w:id="18"/>
+      <w:bookmarkStart w:colFirst="0" w:colLast="0" w:name="_l0wmk8ze3byk" w:id="18"/>
       <w:bookmarkEnd w:id="18"/>
       <w:r>
         <w:rPr>
@@ -9971,7 +9949,7 @@
           <wp:anchor allowOverlap="1" behindDoc="0" distB="114300" distT="114300" distL="114300" distR="114300" hidden="0" layoutInCell="1" locked="0" relativeHeight="0" simplePos="0">
             <wp:simplePos x="0" y="0"/>
             <wp:positionH relativeFrom="column">
-              <wp:posOffset>3</wp:posOffset>
+              <wp:posOffset>5</wp:posOffset>
             </wp:positionH>
             <wp:positionV relativeFrom="paragraph">
               <wp:posOffset>819150</wp:posOffset>
@@ -9979,12 +9957,12 @@
             <wp:extent cx="5943600" cy="2235200"/>
             <wp:effectExtent b="0" l="0" r="0" t="0"/>
             <wp:wrapSquare wrapText="bothSides" distB="114300" distT="114300" distL="114300" distR="114300"/>
-            <wp:docPr id="15" name="image1.png"/>
+            <wp:docPr id="15" name="image4.png"/>
             <a:graphic>
               <a:graphicData uri="http://schemas.openxmlformats.org/drawingml/2006/picture">
                 <pic:pic>
                   <pic:nvPicPr>
-                    <pic:cNvPr id="0" name="image1.png"/>
+                    <pic:cNvPr id="0" name="image4.png"/>
                     <pic:cNvPicPr preferRelativeResize="0"/>
                   </pic:nvPicPr>
                   <pic:blipFill>
@@ -10064,7 +10042,7 @@
           <w:szCs w:val="18"/>
         </w:rPr>
       </w:pPr>
-      <w:bookmarkStart w:colFirst="0" w:colLast="0" w:name="_v5csxrhxasnr" w:id="19"/>
+      <w:bookmarkStart w:colFirst="0" w:colLast="0" w:name="_cmeq9jodj2ol" w:id="19"/>
       <w:bookmarkEnd w:id="19"/>
       <w:r>
         <w:br w:type="page"/>
@@ -10080,7 +10058,7 @@
         <w:pStyle w:val="Heading3"/>
         <w:rPr/>
       </w:pPr>
-      <w:bookmarkStart w:colFirst="0" w:colLast="0" w:name="_zermxggvjrip" w:id="20"/>
+      <w:bookmarkStart w:colFirst="0" w:colLast="0" w:name="_oljd6n3h6nbe" w:id="20"/>
       <w:bookmarkEnd w:id="20"/>
       <w:r>
         <w:rPr>
@@ -10123,12 +10101,12 @@
             <wp:extent cx="5548313" cy="1644932"/>
             <wp:effectExtent b="0" l="0" r="0" t="0"/>
             <wp:wrapSquare wrapText="bothSides" distB="114300" distT="114300" distL="114300" distR="114300"/>
-            <wp:docPr id="14" name="image11.png"/>
+            <wp:docPr id="14" name="image2.png"/>
             <a:graphic>
               <a:graphicData uri="http://schemas.openxmlformats.org/drawingml/2006/picture">
                 <pic:pic>
                   <pic:nvPicPr>
-                    <pic:cNvPr id="0" name="image11.png"/>
+                    <pic:cNvPr id="0" name="image2.png"/>
                     <pic:cNvPicPr preferRelativeResize="0"/>
                   </pic:nvPicPr>
                   <pic:blipFill>
@@ -10190,7 +10168,7 @@
         <w:pStyle w:val="Heading3"/>
         <w:rPr/>
       </w:pPr>
-      <w:bookmarkStart w:colFirst="0" w:colLast="0" w:name="_of8ljlvjgy34" w:id="21"/>
+      <w:bookmarkStart w:colFirst="0" w:colLast="0" w:name="_46lf0p1ffxyv" w:id="21"/>
       <w:bookmarkEnd w:id="21"/>
       <w:r>
         <w:br w:type="page"/>
@@ -10206,7 +10184,7 @@
         <w:pStyle w:val="Heading3"/>
         <w:rPr/>
       </w:pPr>
-      <w:bookmarkStart w:colFirst="0" w:colLast="0" w:name="_t14kis3v5qps" w:id="22"/>
+      <w:bookmarkStart w:colFirst="0" w:colLast="0" w:name="_mse1rpbzt15c" w:id="22"/>
       <w:bookmarkEnd w:id="22"/>
       <w:r>
         <w:rPr>
@@ -10230,7 +10208,7 @@
           <wp:anchor allowOverlap="1" behindDoc="0" distB="114300" distT="114300" distL="114300" distR="114300" hidden="0" layoutInCell="1" locked="0" relativeHeight="0" simplePos="0">
             <wp:simplePos x="0" y="0"/>
             <wp:positionH relativeFrom="column">
-              <wp:posOffset>3</wp:posOffset>
+              <wp:posOffset>5</wp:posOffset>
             </wp:positionH>
             <wp:positionV relativeFrom="paragraph">
               <wp:posOffset>866775</wp:posOffset>
@@ -10338,7 +10316,7 @@
         <w:pStyle w:val="Heading3"/>
         <w:rPr/>
       </w:pPr>
-      <w:bookmarkStart w:colFirst="0" w:colLast="0" w:name="_6hrfgdm9qvpv" w:id="23"/>
+      <w:bookmarkStart w:colFirst="0" w:colLast="0" w:name="_bz4t2tfq8uis" w:id="23"/>
       <w:bookmarkEnd w:id="23"/>
       <w:r>
         <w:rPr>
@@ -10362,7 +10340,7 @@
           <wp:anchor allowOverlap="1" behindDoc="0" distB="114300" distT="114300" distL="114300" distR="114300" hidden="0" layoutInCell="1" locked="0" relativeHeight="0" simplePos="0">
             <wp:simplePos x="0" y="0"/>
             <wp:positionH relativeFrom="column">
-              <wp:posOffset>3</wp:posOffset>
+              <wp:posOffset>5</wp:posOffset>
             </wp:positionH>
             <wp:positionV relativeFrom="paragraph">
               <wp:posOffset>1057275</wp:posOffset>
@@ -10370,12 +10348,12 @@
             <wp:extent cx="5943600" cy="444500"/>
             <wp:effectExtent b="0" l="0" r="0" t="0"/>
             <wp:wrapSquare wrapText="bothSides" distB="114300" distT="114300" distL="114300" distR="114300"/>
-            <wp:docPr id="9" name="image8.png"/>
+            <wp:docPr id="9" name="image6.png"/>
             <a:graphic>
               <a:graphicData uri="http://schemas.openxmlformats.org/drawingml/2006/picture">
                 <pic:pic>
                   <pic:nvPicPr>
-                    <pic:cNvPr id="0" name="image8.png"/>
+                    <pic:cNvPr id="0" name="image6.png"/>
                     <pic:cNvPicPr preferRelativeResize="0"/>
                   </pic:nvPicPr>
                   <pic:blipFill>
@@ -10421,7 +10399,7 @@
           <w:color w:val="351e79"/>
         </w:rPr>
       </w:pPr>
-      <w:bookmarkStart w:colFirst="0" w:colLast="0" w:name="_dqhudu9o0mit" w:id="24"/>
+      <w:bookmarkStart w:colFirst="0" w:colLast="0" w:name="_lkvl3kwpm4kv" w:id="24"/>
       <w:bookmarkEnd w:id="24"/>
       <w:r>
         <w:rPr>
@@ -10581,7 +10559,7 @@
           <w:color w:val="2f5496"/>
         </w:rPr>
       </w:pPr>
-      <w:bookmarkStart w:colFirst="0" w:colLast="0" w:name="_od0swgjbzkhk" w:id="25"/>
+      <w:bookmarkStart w:colFirst="0" w:colLast="0" w:name="_9mxitufs07ew" w:id="25"/>
       <w:bookmarkEnd w:id="25"/>
       <w:r>
         <w:rPr>
@@ -11545,17 +11523,17 @@
                     <wp:posOffset>690563</wp:posOffset>
                   </wp:positionH>
                   <wp:positionV relativeFrom="paragraph">
-                    <wp:posOffset>47628</wp:posOffset>
+                    <wp:posOffset>47630</wp:posOffset>
                   </wp:positionV>
                   <wp:extent cx="214313" cy="233795"/>
                   <wp:effectExtent b="0" l="0" r="0" t="0"/>
                   <wp:wrapSquare wrapText="bothSides" distB="114300" distT="114300" distL="114300" distR="114300"/>
-                  <wp:docPr id="12" name="image5.png"/>
+                  <wp:docPr id="12" name="image8.png"/>
                   <a:graphic>
                     <a:graphicData uri="http://schemas.openxmlformats.org/drawingml/2006/picture">
                       <pic:pic>
                         <pic:nvPicPr>
-                          <pic:cNvPr id="0" name="image5.png"/>
+                          <pic:cNvPr id="0" name="image8.png"/>
                           <pic:cNvPicPr preferRelativeResize="0"/>
                         </pic:nvPicPr>
                         <pic:blipFill>
@@ -11621,17 +11599,17 @@
                     <wp:posOffset>628650</wp:posOffset>
                   </wp:positionH>
                   <wp:positionV relativeFrom="paragraph">
-                    <wp:posOffset>47628</wp:posOffset>
+                    <wp:posOffset>47630</wp:posOffset>
                   </wp:positionV>
                   <wp:extent cx="214313" cy="234723"/>
                   <wp:effectExtent b="0" l="0" r="0" t="0"/>
                   <wp:wrapSquare wrapText="bothSides" distB="114300" distT="114300" distL="114300" distR="114300"/>
-                  <wp:docPr id="11" name="image3.png"/>
+                  <wp:docPr id="11" name="image5.png"/>
                   <a:graphic>
                     <a:graphicData uri="http://schemas.openxmlformats.org/drawingml/2006/picture">
                       <pic:pic>
                         <pic:nvPicPr>
-                          <pic:cNvPr id="0" name="image3.png"/>
+                          <pic:cNvPr id="0" name="image5.png"/>
                           <pic:cNvPicPr preferRelativeResize="0"/>
                         </pic:nvPicPr>
                         <pic:blipFill>
@@ -11698,17 +11676,17 @@
                     <wp:posOffset>590550</wp:posOffset>
                   </wp:positionH>
                   <wp:positionV relativeFrom="paragraph">
-                    <wp:posOffset>47628</wp:posOffset>
+                    <wp:posOffset>47630</wp:posOffset>
                   </wp:positionV>
                   <wp:extent cx="214313" cy="233795"/>
                   <wp:effectExtent b="0" l="0" r="0" t="0"/>
                   <wp:wrapSquare wrapText="bothSides" distB="114300" distT="114300" distL="114300" distR="114300"/>
-                  <wp:docPr id="4" name="image5.png"/>
+                  <wp:docPr id="4" name="image8.png"/>
                   <a:graphic>
                     <a:graphicData uri="http://schemas.openxmlformats.org/drawingml/2006/picture">
                       <pic:pic>
                         <pic:nvPicPr>
-                          <pic:cNvPr id="0" name="image5.png"/>
+                          <pic:cNvPr id="0" name="image8.png"/>
                           <pic:cNvPicPr preferRelativeResize="0"/>
                         </pic:nvPicPr>
                         <pic:blipFill>
@@ -11742,7 +11720,7 @@
         <w:spacing w:line="360" w:lineRule="auto"/>
         <w:rPr/>
       </w:pPr>
-      <w:bookmarkStart w:colFirst="0" w:colLast="0" w:name="_j7t4269ropmz" w:id="26"/>
+      <w:bookmarkStart w:colFirst="0" w:colLast="0" w:name="_kj7gk28dkpyd" w:id="26"/>
       <w:bookmarkEnd w:id="26"/>
       <w:r>
         <w:rPr>
@@ -11756,7 +11734,7 @@
         <w:spacing w:line="360" w:lineRule="auto"/>
         <w:rPr/>
       </w:pPr>
-      <w:bookmarkStart w:colFirst="0" w:colLast="0" w:name="_br0r4uvnxzqx" w:id="27"/>
+      <w:bookmarkStart w:colFirst="0" w:colLast="0" w:name="_ycg5ybqcv5ac" w:id="27"/>
       <w:bookmarkEnd w:id="27"/>
       <w:r>
         <w:br w:type="page"/>
@@ -11772,7 +11750,7 @@
         <w:pStyle w:val="Heading3"/>
         <w:rPr/>
       </w:pPr>
-      <w:bookmarkStart w:colFirst="0" w:colLast="0" w:name="_o4clkzuhr15l" w:id="28"/>
+      <w:bookmarkStart w:colFirst="0" w:colLast="0" w:name="_16ze0jaj4y50" w:id="28"/>
       <w:bookmarkEnd w:id="28"/>
       <w:r>
         <w:rPr>
@@ -12209,7 +12187,7 @@
         <w:pStyle w:val="Heading3"/>
         <w:rPr/>
       </w:pPr>
-      <w:bookmarkStart w:colFirst="0" w:colLast="0" w:name="_4ve6v9wsrhpb" w:id="29"/>
+      <w:bookmarkStart w:colFirst="0" w:colLast="0" w:name="_3xb2jjwd9qqy" w:id="29"/>
       <w:bookmarkEnd w:id="29"/>
       <w:r>
         <w:rPr>
@@ -12846,7 +12824,7 @@
         <w:pStyle w:val="Heading3"/>
         <w:rPr/>
       </w:pPr>
-      <w:bookmarkStart w:colFirst="0" w:colLast="0" w:name="_ltiyn6352djr" w:id="30"/>
+      <w:bookmarkStart w:colFirst="0" w:colLast="0" w:name="_r00sm4vlv1n9" w:id="30"/>
       <w:bookmarkEnd w:id="30"/>
       <w:r>
         <w:rPr>
@@ -13346,7 +13324,7 @@
         <w:pStyle w:val="Heading1"/>
         <w:rPr/>
       </w:pPr>
-      <w:bookmarkStart w:colFirst="0" w:colLast="0" w:name="_seofsiv4w34m" w:id="31"/>
+      <w:bookmarkStart w:colFirst="0" w:colLast="0" w:name="_ue5t1jvl2u69" w:id="31"/>
       <w:bookmarkEnd w:id="31"/>
       <w:r>
         <w:br w:type="page"/>
@@ -13362,7 +13340,7 @@
         <w:pStyle w:val="Heading1"/>
         <w:rPr/>
       </w:pPr>
-      <w:bookmarkStart w:colFirst="0" w:colLast="0" w:name="_sb30ef4fseov" w:id="32"/>
+      <w:bookmarkStart w:colFirst="0" w:colLast="0" w:name="_x69x03t0zpbr" w:id="32"/>
       <w:bookmarkEnd w:id="32"/>
       <w:r>
         <w:rPr>
@@ -14474,7 +14452,7 @@
         <w:spacing w:before="0" w:lineRule="auto"/>
         <w:rPr/>
       </w:pPr>
-      <w:bookmarkStart w:colFirst="0" w:colLast="0" w:name="_hp8oqnfkdjd2" w:id="33"/>
+      <w:bookmarkStart w:colFirst="0" w:colLast="0" w:name="_iewvxbgwnc6b" w:id="33"/>
       <w:bookmarkEnd w:id="33"/>
       <w:r>
         <w:br w:type="page"/>
@@ -14490,7 +14468,7 @@
         <w:pStyle w:val="Heading1"/>
         <w:rPr/>
       </w:pPr>
-      <w:bookmarkStart w:colFirst="0" w:colLast="0" w:name="_qm8odj942vdv" w:id="34"/>
+      <w:bookmarkStart w:colFirst="0" w:colLast="0" w:name="_mktauvycza3k" w:id="34"/>
       <w:bookmarkEnd w:id="34"/>
       <w:r>
         <w:rPr>
@@ -17307,7 +17285,7 @@
         <w:spacing w:before="0" w:lineRule="auto"/>
         <w:rPr/>
       </w:pPr>
-      <w:bookmarkStart w:colFirst="0" w:colLast="0" w:name="_db72lu992exr" w:id="35"/>
+      <w:bookmarkStart w:colFirst="0" w:colLast="0" w:name="_41b9e2mw4ro8" w:id="35"/>
       <w:bookmarkEnd w:id="35"/>
       <w:r>
         <w:rPr>
@@ -17325,7 +17303,7 @@
         <w:spacing w:before="0" w:lineRule="auto"/>
         <w:rPr/>
       </w:pPr>
-      <w:bookmarkStart w:colFirst="0" w:colLast="0" w:name="_34tz6l7l62zd" w:id="36"/>
+      <w:bookmarkStart w:colFirst="0" w:colLast="0" w:name="_mvgwi7fphj1p" w:id="36"/>
       <w:bookmarkEnd w:id="36"/>
       <w:r>
         <w:rPr>
@@ -17363,7 +17341,7 @@
           <w:color w:val="2f5496"/>
         </w:rPr>
       </w:pPr>
-      <w:bookmarkStart w:colFirst="0" w:colLast="0" w:name="_6u63seo8rzle" w:id="37"/>
+      <w:bookmarkStart w:colFirst="0" w:colLast="0" w:name="_batz70rbfukk" w:id="37"/>
       <w:bookmarkEnd w:id="37"/>
       <w:r>
         <w:rPr>
@@ -17778,7 +17756,7 @@
           <w:color w:val="674ea7"/>
         </w:rPr>
       </w:pPr>
-      <w:bookmarkStart w:colFirst="0" w:colLast="0" w:name="_m07yhqdwxzyx" w:id="38"/>
+      <w:bookmarkStart w:colFirst="0" w:colLast="0" w:name="_5fafj29pdgm" w:id="38"/>
       <w:bookmarkEnd w:id="38"/>
       <w:r>
         <w:rPr>
@@ -17809,7 +17787,7 @@
         <w:spacing w:after="200" w:lineRule="auto"/>
         <w:rPr/>
       </w:pPr>
-      <w:bookmarkStart w:colFirst="0" w:colLast="0" w:name="_6n3tpeg38w1u" w:id="39"/>
+      <w:bookmarkStart w:colFirst="0" w:colLast="0" w:name="_pw98fb9dfxqh" w:id="39"/>
       <w:bookmarkEnd w:id="39"/>
       <w:r>
         <w:rPr>
@@ -17834,7 +17812,7 @@
         <w:pStyle w:val="Heading4"/>
         <w:rPr/>
       </w:pPr>
-      <w:bookmarkStart w:colFirst="0" w:colLast="0" w:name="_6ic15qb2zw5a" w:id="40"/>
+      <w:bookmarkStart w:colFirst="0" w:colLast="0" w:name="_63m9ovryfvg6" w:id="40"/>
       <w:bookmarkEnd w:id="40"/>
       <w:r>
         <w:rPr>
@@ -17914,7 +17892,7 @@
         <w:pStyle w:val="Heading4"/>
         <w:rPr/>
       </w:pPr>
-      <w:bookmarkStart w:colFirst="0" w:colLast="0" w:name="_d1r7jfdw1o5z" w:id="41"/>
+      <w:bookmarkStart w:colFirst="0" w:colLast="0" w:name="_k7w5jyplbp19" w:id="41"/>
       <w:bookmarkEnd w:id="41"/>
       <w:r>
         <w:rPr>
@@ -17983,7 +17961,7 @@
         <w:pStyle w:val="Heading4"/>
         <w:rPr/>
       </w:pPr>
-      <w:bookmarkStart w:colFirst="0" w:colLast="0" w:name="_szddppk8v207" w:id="42"/>
+      <w:bookmarkStart w:colFirst="0" w:colLast="0" w:name="_7hreponcgkv9" w:id="42"/>
       <w:bookmarkEnd w:id="42"/>
       <w:r>
         <w:rPr>
@@ -18065,11 +18043,6 @@
         </w:rPr>
         <w:t xml:space="preserve">{{REFERENCE}}</w:t>
       </w:r>
-      <w:r>
-        <w:rPr>
-          <w:rtl w:val="0"/>
-        </w:rPr>
-      </w:r>
     </w:p>
     <w:p>
       <w:pPr>
@@ -18185,7 +18158,7 @@
           <w:szCs w:val="20"/>
         </w:rPr>
       </w:pPr>
-      <w:bookmarkStart w:colFirst="0" w:colLast="0" w:name="_hwf1ds8bv8im" w:id="43"/>
+      <w:bookmarkStart w:colFirst="0" w:colLast="0" w:name="_8rsekzj0w9os" w:id="43"/>
       <w:bookmarkEnd w:id="43"/>
       <w:r>
         <w:rPr>
@@ -18228,7 +18201,7 @@
           <w:color w:val="2f5496"/>
         </w:rPr>
       </w:pPr>
-      <w:bookmarkStart w:colFirst="0" w:colLast="0" w:name="_3uhyy0xd21mc" w:id="44"/>
+      <w:bookmarkStart w:colFirst="0" w:colLast="0" w:name="_ln8i8vowtjx9" w:id="44"/>
       <w:bookmarkEnd w:id="44"/>
       <w:r>
         <w:rPr>
@@ -18637,7 +18610,7 @@
           <w:color w:val="674ea7"/>
         </w:rPr>
       </w:pPr>
-      <w:bookmarkStart w:colFirst="0" w:colLast="0" w:name="_whalcc4sv5sm" w:id="45"/>
+      <w:bookmarkStart w:colFirst="0" w:colLast="0" w:name="_bznc52am2swo" w:id="45"/>
       <w:bookmarkEnd w:id="45"/>
       <w:r>
         <w:rPr>
@@ -18668,7 +18641,7 @@
         <w:spacing w:after="200" w:lineRule="auto"/>
         <w:rPr/>
       </w:pPr>
-      <w:bookmarkStart w:colFirst="0" w:colLast="0" w:name="_bv8p7tjqpbjb" w:id="46"/>
+      <w:bookmarkStart w:colFirst="0" w:colLast="0" w:name="_qycrwsmfyktp" w:id="46"/>
       <w:bookmarkEnd w:id="46"/>
       <w:r>
         <w:rPr>
@@ -18693,7 +18666,7 @@
         <w:pStyle w:val="Heading4"/>
         <w:rPr/>
       </w:pPr>
-      <w:bookmarkStart w:colFirst="0" w:colLast="0" w:name="_xpolanux6jm" w:id="47"/>
+      <w:bookmarkStart w:colFirst="0" w:colLast="0" w:name="_m3nxyfu0frw8" w:id="47"/>
       <w:bookmarkEnd w:id="47"/>
       <w:r>
         <w:rPr>
@@ -18763,7 +18736,7 @@
         <w:pStyle w:val="Heading4"/>
         <w:rPr/>
       </w:pPr>
-      <w:bookmarkStart w:colFirst="0" w:colLast="0" w:name="_1sfc8ggm4a23" w:id="48"/>
+      <w:bookmarkStart w:colFirst="0" w:colLast="0" w:name="_1qqk8ijmnjfq" w:id="48"/>
       <w:bookmarkEnd w:id="48"/>
       <w:r>
         <w:rPr>
@@ -18832,7 +18805,7 @@
         <w:pStyle w:val="Heading4"/>
         <w:rPr/>
       </w:pPr>
-      <w:bookmarkStart w:colFirst="0" w:colLast="0" w:name="_r8y081n6dqux" w:id="49"/>
+      <w:bookmarkStart w:colFirst="0" w:colLast="0" w:name="_s57bwvr6dbjl" w:id="49"/>
       <w:bookmarkEnd w:id="49"/>
       <w:r>
         <w:rPr>
@@ -19003,7 +18976,7 @@
         <w:spacing w:after="200" w:line="276" w:lineRule="auto"/>
         <w:rPr/>
       </w:pPr>
-      <w:bookmarkStart w:colFirst="0" w:colLast="0" w:name="_diapefpw5udh" w:id="50"/>
+      <w:bookmarkStart w:colFirst="0" w:colLast="0" w:name="_t6qglqjscg7g" w:id="50"/>
       <w:bookmarkEnd w:id="50"/>
       <w:r>
         <w:rPr>
@@ -19041,7 +19014,7 @@
           <w:color w:val="2f5496"/>
         </w:rPr>
       </w:pPr>
-      <w:bookmarkStart w:colFirst="0" w:colLast="0" w:name="_l3vyk264je69" w:id="51"/>
+      <w:bookmarkStart w:colFirst="0" w:colLast="0" w:name="_ayghn92zh98x" w:id="51"/>
       <w:bookmarkEnd w:id="51"/>
       <w:r>
         <w:rPr>
@@ -19449,7 +19422,7 @@
           <w:color w:val="674ea7"/>
         </w:rPr>
       </w:pPr>
-      <w:bookmarkStart w:colFirst="0" w:colLast="0" w:name="_4fiqmgu8nuc7" w:id="52"/>
+      <w:bookmarkStart w:colFirst="0" w:colLast="0" w:name="_52cj2ehkp2cy" w:id="52"/>
       <w:bookmarkEnd w:id="52"/>
       <w:r>
         <w:rPr>
@@ -19480,7 +19453,7 @@
         <w:spacing w:after="200" w:lineRule="auto"/>
         <w:rPr/>
       </w:pPr>
-      <w:bookmarkStart w:colFirst="0" w:colLast="0" w:name="_5n6vdb4x7229" w:id="53"/>
+      <w:bookmarkStart w:colFirst="0" w:colLast="0" w:name="_og4g5ze298oa" w:id="53"/>
       <w:bookmarkEnd w:id="53"/>
       <w:r>
         <w:rPr>
@@ -19505,7 +19478,7 @@
         <w:pStyle w:val="Heading4"/>
         <w:rPr/>
       </w:pPr>
-      <w:bookmarkStart w:colFirst="0" w:colLast="0" w:name="_6853wg8ewag1" w:id="54"/>
+      <w:bookmarkStart w:colFirst="0" w:colLast="0" w:name="_ga4k0bup1e8e" w:id="54"/>
       <w:bookmarkEnd w:id="54"/>
       <w:r>
         <w:rPr>
@@ -19575,7 +19548,7 @@
         <w:pStyle w:val="Heading4"/>
         <w:rPr/>
       </w:pPr>
-      <w:bookmarkStart w:colFirst="0" w:colLast="0" w:name="_emknfqwl9ovj" w:id="55"/>
+      <w:bookmarkStart w:colFirst="0" w:colLast="0" w:name="_6tkix8yz4a2t" w:id="55"/>
       <w:bookmarkEnd w:id="55"/>
       <w:r>
         <w:rPr>
@@ -19644,7 +19617,7 @@
         <w:pStyle w:val="Heading4"/>
         <w:rPr/>
       </w:pPr>
-      <w:bookmarkStart w:colFirst="0" w:colLast="0" w:name="_ftmgtfez8z30" w:id="56"/>
+      <w:bookmarkStart w:colFirst="0" w:colLast="0" w:name="_q1meaujg7ldl" w:id="56"/>
       <w:bookmarkEnd w:id="56"/>
       <w:r>
         <w:rPr>
@@ -19814,7 +19787,7 @@
         <w:spacing w:after="200" w:line="276" w:lineRule="auto"/>
         <w:rPr/>
       </w:pPr>
-      <w:bookmarkStart w:colFirst="0" w:colLast="0" w:name="_xx7yytsq2hg0" w:id="57"/>
+      <w:bookmarkStart w:colFirst="0" w:colLast="0" w:name="_gnj2l4eo16by" w:id="57"/>
       <w:bookmarkEnd w:id="57"/>
       <w:r>
         <w:rPr>
@@ -19852,7 +19825,7 @@
           <w:color w:val="2f5496"/>
         </w:rPr>
       </w:pPr>
-      <w:bookmarkStart w:colFirst="0" w:colLast="0" w:name="_o4orju9vr1ly" w:id="58"/>
+      <w:bookmarkStart w:colFirst="0" w:colLast="0" w:name="_kku56lsfpv8v" w:id="58"/>
       <w:bookmarkEnd w:id="58"/>
       <w:r>
         <w:rPr>
@@ -20264,7 +20237,7 @@
           <w:color w:val="674ea7"/>
         </w:rPr>
       </w:pPr>
-      <w:bookmarkStart w:colFirst="0" w:colLast="0" w:name="_tdof5jrgh18" w:id="59"/>
+      <w:bookmarkStart w:colFirst="0" w:colLast="0" w:name="_8fsmd9wnixcj" w:id="59"/>
       <w:bookmarkEnd w:id="59"/>
       <w:r>
         <w:rPr>
@@ -20295,7 +20268,7 @@
         <w:spacing w:after="200" w:lineRule="auto"/>
         <w:rPr/>
       </w:pPr>
-      <w:bookmarkStart w:colFirst="0" w:colLast="0" w:name="_1rosfjjso5w4" w:id="60"/>
+      <w:bookmarkStart w:colFirst="0" w:colLast="0" w:name="_8a278z1l08sa" w:id="60"/>
       <w:bookmarkEnd w:id="60"/>
       <w:r>
         <w:rPr>
@@ -20320,7 +20293,7 @@
         <w:pStyle w:val="Heading4"/>
         <w:rPr/>
       </w:pPr>
-      <w:bookmarkStart w:colFirst="0" w:colLast="0" w:name="_ezxbhkxgytw3" w:id="61"/>
+      <w:bookmarkStart w:colFirst="0" w:colLast="0" w:name="_h3ccvglnic2q" w:id="61"/>
       <w:bookmarkEnd w:id="61"/>
       <w:r>
         <w:rPr>
@@ -20390,7 +20363,7 @@
         <w:pStyle w:val="Heading4"/>
         <w:rPr/>
       </w:pPr>
-      <w:bookmarkStart w:colFirst="0" w:colLast="0" w:name="_es4n2a7i5kh0" w:id="62"/>
+      <w:bookmarkStart w:colFirst="0" w:colLast="0" w:name="_ycciyqnngacw" w:id="62"/>
       <w:bookmarkEnd w:id="62"/>
       <w:r>
         <w:rPr>
@@ -20459,7 +20432,7 @@
         <w:pStyle w:val="Heading4"/>
         <w:rPr/>
       </w:pPr>
-      <w:bookmarkStart w:colFirst="0" w:colLast="0" w:name="_cpg1k5piqms2" w:id="63"/>
+      <w:bookmarkStart w:colFirst="0" w:colLast="0" w:name="_xz21u2cekp27" w:id="63"/>
       <w:bookmarkEnd w:id="63"/>
       <w:r>
         <w:rPr>
@@ -20634,7 +20607,7 @@
           <w:szCs w:val="20"/>
         </w:rPr>
       </w:pPr>
-      <w:bookmarkStart w:colFirst="0" w:colLast="0" w:name="_gxmdakj7lxdy" w:id="64"/>
+      <w:bookmarkStart w:colFirst="0" w:colLast="0" w:name="_nvdf825mkew4" w:id="64"/>
       <w:bookmarkEnd w:id="64"/>
       <w:r>
         <w:rPr>
@@ -20677,7 +20650,7 @@
           <w:color w:val="2f5496"/>
         </w:rPr>
       </w:pPr>
-      <w:bookmarkStart w:colFirst="0" w:colLast="0" w:name="_1navuxnv7va7" w:id="65"/>
+      <w:bookmarkStart w:colFirst="0" w:colLast="0" w:name="_1exw51asphgv" w:id="65"/>
       <w:bookmarkEnd w:id="65"/>
       <w:r>
         <w:rPr>
@@ -21089,7 +21062,7 @@
           <w:color w:val="674ea7"/>
         </w:rPr>
       </w:pPr>
-      <w:bookmarkStart w:colFirst="0" w:colLast="0" w:name="_t3jvbp5xe23c" w:id="66"/>
+      <w:bookmarkStart w:colFirst="0" w:colLast="0" w:name="_vwj6w78ccpuh" w:id="66"/>
       <w:bookmarkEnd w:id="66"/>
       <w:r>
         <w:rPr>
@@ -21120,7 +21093,7 @@
         <w:spacing w:after="200" w:lineRule="auto"/>
         <w:rPr/>
       </w:pPr>
-      <w:bookmarkStart w:colFirst="0" w:colLast="0" w:name="_khuegstkbbb1" w:id="67"/>
+      <w:bookmarkStart w:colFirst="0" w:colLast="0" w:name="_288mp36jj6ix" w:id="67"/>
       <w:bookmarkEnd w:id="67"/>
       <w:r>
         <w:rPr>
@@ -21145,7 +21118,7 @@
         <w:pStyle w:val="Heading4"/>
         <w:rPr/>
       </w:pPr>
-      <w:bookmarkStart w:colFirst="0" w:colLast="0" w:name="_1uftgucl4l0l" w:id="68"/>
+      <w:bookmarkStart w:colFirst="0" w:colLast="0" w:name="_l6o0izd4pa6v" w:id="68"/>
       <w:bookmarkEnd w:id="68"/>
       <w:r>
         <w:rPr>
@@ -21215,7 +21188,7 @@
         <w:pStyle w:val="Heading4"/>
         <w:rPr/>
       </w:pPr>
-      <w:bookmarkStart w:colFirst="0" w:colLast="0" w:name="_9fcififswm1r" w:id="69"/>
+      <w:bookmarkStart w:colFirst="0" w:colLast="0" w:name="_blwyug6310ek" w:id="69"/>
       <w:bookmarkEnd w:id="69"/>
       <w:r>
         <w:rPr>
@@ -21284,7 +21257,7 @@
         <w:pStyle w:val="Heading4"/>
         <w:rPr/>
       </w:pPr>
-      <w:bookmarkStart w:colFirst="0" w:colLast="0" w:name="_roj7achtyf71" w:id="70"/>
+      <w:bookmarkStart w:colFirst="0" w:colLast="0" w:name="_666ssse7se2i" w:id="70"/>
       <w:bookmarkEnd w:id="70"/>
       <w:r>
         <w:rPr>
@@ -21445,7 +21418,7 @@
         <w:pStyle w:val="Heading1"/>
         <w:rPr/>
       </w:pPr>
-      <w:bookmarkStart w:colFirst="0" w:colLast="0" w:name="_vqc12rf86pey" w:id="71"/>
+      <w:bookmarkStart w:colFirst="0" w:colLast="0" w:name="_wy4bp9drucc3" w:id="71"/>
       <w:bookmarkEnd w:id="71"/>
       <w:r>
         <w:br w:type="page"/>
@@ -21461,7 +21434,7 @@
         <w:pStyle w:val="Heading1"/>
         <w:rPr/>
       </w:pPr>
-      <w:bookmarkStart w:colFirst="0" w:colLast="0" w:name="_6azblliyy4qq" w:id="72"/>
+      <w:bookmarkStart w:colFirst="0" w:colLast="0" w:name="_8iblj21rsagk" w:id="72"/>
       <w:bookmarkEnd w:id="72"/>
       <w:r>
         <w:rPr>
@@ -23251,12 +23224,12 @@
             <wp:extent cx="2928938" cy="474075"/>
             <wp:effectExtent b="0" l="0" r="0" t="0"/>
             <wp:wrapNone/>
-            <wp:docPr id="2" name="image4.png"/>
+            <wp:docPr id="2" name="image9.png"/>
             <a:graphic>
               <a:graphicData uri="http://schemas.openxmlformats.org/drawingml/2006/picture">
                 <pic:pic>
                   <pic:nvPicPr>
-                    <pic:cNvPr id="0" name="image4.png"/>
+                    <pic:cNvPr id="0" name="image9.png"/>
                     <pic:cNvPicPr preferRelativeResize="0"/>
                   </pic:nvPicPr>
                   <pic:blipFill>
@@ -23411,12 +23384,12 @@
           <wp:extent cx="1050571" cy="235642"/>
           <wp:effectExtent b="0" l="0" r="0" t="0"/>
           <wp:wrapNone/>
-          <wp:docPr id="7" name="image10.png"/>
+          <wp:docPr id="7" name="image11.png"/>
           <a:graphic>
             <a:graphicData uri="http://schemas.openxmlformats.org/drawingml/2006/picture">
               <pic:pic>
                 <pic:nvPicPr>
-                  <pic:cNvPr id="0" name="image10.png"/>
+                  <pic:cNvPr id="0" name="image11.png"/>
                   <pic:cNvPicPr preferRelativeResize="0"/>
                 </pic:nvPicPr>
                 <pic:blipFill>
@@ -23608,7 +23581,7 @@
         <wp:anchor allowOverlap="1" behindDoc="1" distB="0" distT="0" distL="0" distR="0" hidden="0" layoutInCell="1" locked="0" relativeHeight="0" simplePos="0">
           <wp:simplePos x="0" y="0"/>
           <wp:positionH relativeFrom="column">
-            <wp:posOffset>-476246</wp:posOffset>
+            <wp:posOffset>-476243</wp:posOffset>
           </wp:positionH>
           <wp:positionV relativeFrom="paragraph">
             <wp:posOffset>349250</wp:posOffset>
@@ -23616,12 +23589,12 @@
           <wp:extent cx="1890713" cy="309823"/>
           <wp:effectExtent b="0" l="0" r="0" t="0"/>
           <wp:wrapNone/>
-          <wp:docPr id="1" name="image9.png"/>
+          <wp:docPr id="1" name="image3.png"/>
           <a:graphic>
             <a:graphicData uri="http://schemas.openxmlformats.org/drawingml/2006/picture">
               <pic:pic>
                 <pic:nvPicPr>
-                  <pic:cNvPr id="0" name="image9.png"/>
+                  <pic:cNvPr id="0" name="image3.png"/>
                   <pic:cNvPicPr preferRelativeResize="0"/>
                 </pic:nvPicPr>
                 <pic:blipFill>
@@ -23669,17 +23642,17 @@
             <wp:posOffset>7143750</wp:posOffset>
           </wp:positionH>
           <wp:positionV relativeFrom="page">
-            <wp:posOffset>-590547</wp:posOffset>
+            <wp:posOffset>-590545</wp:posOffset>
           </wp:positionV>
           <wp:extent cx="1100137" cy="2246435"/>
           <wp:effectExtent b="0" l="0" r="0" t="0"/>
           <wp:wrapNone/>
-          <wp:docPr id="5" name="image2.png"/>
+          <wp:docPr id="5" name="image10.png"/>
           <a:graphic>
             <a:graphicData uri="http://schemas.openxmlformats.org/drawingml/2006/picture">
               <pic:pic>
                 <pic:nvPicPr>
-                  <pic:cNvPr id="0" name="image2.png"/>
+                  <pic:cNvPr id="0" name="image10.png"/>
                   <pic:cNvPicPr preferRelativeResize="0"/>
                 </pic:nvPicPr>
                 <pic:blipFill>
@@ -23727,17 +23700,17 @@
             <wp:posOffset>7181850</wp:posOffset>
           </wp:positionH>
           <wp:positionV relativeFrom="page">
-            <wp:posOffset>-581022</wp:posOffset>
+            <wp:posOffset>-581020</wp:posOffset>
           </wp:positionV>
           <wp:extent cx="1100137" cy="2246435"/>
           <wp:effectExtent b="0" l="0" r="0" t="0"/>
           <wp:wrapNone/>
-          <wp:docPr id="8" name="image2.png"/>
+          <wp:docPr id="8" name="image10.png"/>
           <a:graphic>
             <a:graphicData uri="http://schemas.openxmlformats.org/drawingml/2006/picture">
               <pic:pic>
                 <pic:nvPicPr>
-                  <pic:cNvPr id="0" name="image2.png"/>
+                  <pic:cNvPr id="0" name="image10.png"/>
                   <pic:cNvPicPr preferRelativeResize="0"/>
                 </pic:nvPicPr>
                 <pic:blipFill>
@@ -23771,7 +23744,7 @@
         <wp:anchor allowOverlap="1" behindDoc="1" distB="0" distT="0" distL="0" distR="0" hidden="0" layoutInCell="1" locked="0" relativeHeight="0" simplePos="0">
           <wp:simplePos x="0" y="0"/>
           <wp:positionH relativeFrom="column">
-            <wp:posOffset>-457196</wp:posOffset>
+            <wp:posOffset>-457193</wp:posOffset>
           </wp:positionH>
           <wp:positionV relativeFrom="paragraph">
             <wp:posOffset>385762</wp:posOffset>
@@ -23779,12 +23752,12 @@
           <wp:extent cx="1890713" cy="309823"/>
           <wp:effectExtent b="0" l="0" r="0" t="0"/>
           <wp:wrapNone/>
-          <wp:docPr id="6" name="image9.png"/>
+          <wp:docPr id="6" name="image3.png"/>
           <a:graphic>
             <a:graphicData uri="http://schemas.openxmlformats.org/drawingml/2006/picture">
               <pic:pic>
                 <pic:nvPicPr>
-                  <pic:cNvPr id="0" name="image9.png"/>
+                  <pic:cNvPr id="0" name="image3.png"/>
                   <pic:cNvPicPr preferRelativeResize="0"/>
                 </pic:nvPicPr>
                 <pic:blipFill>

</xml_diff>